<commit_message>
Created console application and added provided source code for the game title
</commit_message>
<xml_diff>
--- a/Dead Mans Draw++ - Design.docx
+++ b/Dead Mans Draw++ - Design.docx
@@ -15,10 +15,143 @@
       </w:r>
     </w:p>
     <w:p/>
+    <w:p>
+      <w:r>
+        <w:rPr>
+          <w:noProof/>
+        </w:rPr>
+        <w:drawing>
+          <wp:inline distT="0" distB="0" distL="0" distR="0" wp14:anchorId="504A4904" wp14:editId="271CC6E1">
+            <wp:extent cx="8863965" cy="4326255"/>
+            <wp:effectExtent l="0" t="0" r="0" b="0"/>
+            <wp:docPr id="146100771" name="Picture 2"/>
+            <wp:cNvGraphicFramePr>
+              <a:graphicFrameLocks xmlns:a="http://schemas.openxmlformats.org/drawingml/2006/main" noChangeAspect="1"/>
+            </wp:cNvGraphicFramePr>
+            <a:graphic xmlns:a="http://schemas.openxmlformats.org/drawingml/2006/main">
+              <a:graphicData uri="http://schemas.openxmlformats.org/drawingml/2006/picture">
+                <pic:pic xmlns:pic="http://schemas.openxmlformats.org/drawingml/2006/picture">
+                  <pic:nvPicPr>
+                    <pic:cNvPr id="0" name="Picture 4"/>
+                    <pic:cNvPicPr>
+                      <a:picLocks noChangeAspect="1" noChangeArrowheads="1"/>
+                    </pic:cNvPicPr>
+                  </pic:nvPicPr>
+                  <pic:blipFill>
+                    <a:blip r:embed="rId6">
+                      <a:extLst>
+                        <a:ext uri="{28A0092B-C50C-407E-A947-70E740481C1C}">
+                          <a14:useLocalDpi xmlns:a14="http://schemas.microsoft.com/office/drawing/2010/main" val="0"/>
+                        </a:ext>
+                      </a:extLst>
+                    </a:blip>
+                    <a:srcRect/>
+                    <a:stretch>
+                      <a:fillRect/>
+                    </a:stretch>
+                  </pic:blipFill>
+                  <pic:spPr bwMode="auto">
+                    <a:xfrm>
+                      <a:off x="0" y="0"/>
+                      <a:ext cx="8863965" cy="4326255"/>
+                    </a:xfrm>
+                    <a:prstGeom prst="rect">
+                      <a:avLst/>
+                    </a:prstGeom>
+                    <a:noFill/>
+                    <a:ln>
+                      <a:noFill/>
+                    </a:ln>
+                  </pic:spPr>
+                </pic:pic>
+              </a:graphicData>
+            </a:graphic>
+          </wp:inline>
+        </w:drawing>
+      </w:r>
+    </w:p>
+    <w:p>
+      <w:r>
+        <w:br w:type="page"/>
+      </w:r>
+    </w:p>
+    <w:p>
+      <w:pPr>
+        <w:sectPr>
+          <w:headerReference w:type="default" r:id="rId7"/>
+          <w:pgSz w:w="16838" w:h="11906" w:orient="landscape"/>
+          <w:pgMar w:top="1440" w:right="1440" w:bottom="1440" w:left="1440" w:header="709" w:footer="709" w:gutter="0"/>
+          <w:cols w:space="708"/>
+          <w:docGrid w:linePitch="360"/>
+        </w:sectPr>
+      </w:pPr>
+    </w:p>
+    <w:p>
+      <w:pPr>
+        <w:pStyle w:val="Heading1"/>
+      </w:pPr>
+      <w:r>
+        <w:lastRenderedPageBreak/>
+        <w:t>Design Decisions</w:t>
+      </w:r>
+    </w:p>
+    <w:p>
+      <w:r>
+        <w:t>Card is abstract so each suit can implement its own play(...) behaviour separately, making the design easier to extend.</w:t>
+      </w:r>
+    </w:p>
+    <w:p>
+      <w:r>
+        <w:t>Game owns the deck, discard pile, turn counter, and player switching because those are explicitly listed as Game responsibilities.</w:t>
+      </w:r>
+    </w:p>
+    <w:p>
+      <w:r>
+        <w:t xml:space="preserve">Player owns </w:t>
+      </w:r>
+      <w:proofErr w:type="spellStart"/>
+      <w:r>
+        <w:t>playArea</w:t>
+      </w:r>
+      <w:proofErr w:type="spellEnd"/>
+      <w:r>
+        <w:t xml:space="preserve"> and bank because the spec says the player manages both collections, bust detection, printing, and scoring.</w:t>
+      </w:r>
+    </w:p>
+    <w:p>
+      <w:proofErr w:type="spellStart"/>
+      <w:r>
+        <w:t>ChestCard</w:t>
+      </w:r>
+      <w:proofErr w:type="spellEnd"/>
+      <w:r>
+        <w:t xml:space="preserve"> and </w:t>
+      </w:r>
+      <w:proofErr w:type="spellStart"/>
+      <w:r>
+        <w:t>KeyCard</w:t>
+      </w:r>
+      <w:proofErr w:type="spellEnd"/>
+      <w:r>
+        <w:t xml:space="preserve"> use </w:t>
+      </w:r>
+      <w:proofErr w:type="spellStart"/>
+      <w:r>
+        <w:t>willAddToBank</w:t>
+      </w:r>
+      <w:proofErr w:type="spellEnd"/>
+      <w:r>
+        <w:t>(...) because their ability happens during banking rather than immediately when drawn.</w:t>
+      </w:r>
+    </w:p>
+    <w:p>
+      <w:r>
+        <w:t>Associations were kept one-way where possible to satisfy the instruction to carefully consider direction of accessibility between classes.</w:t>
+      </w:r>
+    </w:p>
     <w:sectPr>
-      <w:headerReference w:type="default" r:id="rId6"/>
       <w:pgSz w:w="11906" w:h="16838"/>
-      <w:pgMar w:top="1440" w:right="1440" w:bottom="1440" w:left="1440" w:header="708" w:footer="708" w:gutter="0"/>
+      <w:pgMar w:top="1440" w:right="1440" w:bottom="1440" w:left="1440" w:header="709" w:footer="709" w:gutter="0"/>
       <w:cols w:space="708"/>
       <w:docGrid w:linePitch="360"/>
     </w:sectPr>
@@ -532,7 +665,6 @@
     <w:next w:val="Normal"/>
     <w:link w:val="Heading2Char"/>
     <w:uiPriority w:val="9"/>
-    <w:semiHidden/>
     <w:unhideWhenUsed/>
     <w:qFormat/>
     <w:rsid w:val="000F5A88"/>
@@ -749,7 +881,6 @@
     <w:basedOn w:val="DefaultParagraphFont"/>
     <w:link w:val="Heading2"/>
     <w:uiPriority w:val="9"/>
-    <w:semiHidden/>
     <w:rsid w:val="000F5A88"/>
     <w:rPr>
       <w:rFonts w:asciiTheme="majorHAnsi" w:eastAsiaTheme="majorEastAsia" w:hAnsiTheme="majorHAnsi" w:cstheme="majorBidi"/>

</xml_diff>